<commit_message>
class diagram 1차 최종 upload
</commit_message>
<xml_diff>
--- a/for communi_& classDia.docx
+++ b/for communi_& classDia.docx
@@ -19,13 +19,13 @@
           </w:tcPr>
           <w:p>
             <w:r>
-              <w:t>Signup</w:t>
-            </w:r>
-            <w:r>
-              <w:t xml:space="preserve"> </w:t>
-            </w:r>
-            <w:r>
-              <w:t>UI</w:t>
+              <w:rPr>
+                <w:lang w:eastAsia="ko-KR"/>
+              </w:rPr>
+              <w:t>e</w:t>
+            </w:r>
+            <w:r>
+              <w:t>Signup UI</w:t>
             </w:r>
           </w:p>
         </w:tc>
@@ -55,10 +55,7 @@
           </w:p>
           <w:p>
             <w:r>
-              <w:t>3</w:t>
-            </w:r>
-            <w:r>
-              <w:t xml:space="preserve">. </w:t>
+              <w:t xml:space="preserve">3. </w:t>
             </w:r>
             <w:proofErr w:type="spellStart"/>
             <w:proofErr w:type="gramStart"/>
@@ -228,10 +225,7 @@
           </w:tcPr>
           <w:p>
             <w:r>
-              <w:t xml:space="preserve">Login </w:t>
-            </w:r>
-            <w:r>
-              <w:t>UI</w:t>
+              <w:t>Login UI</w:t>
             </w:r>
           </w:p>
         </w:tc>
@@ -248,13 +242,7 @@
             <w:proofErr w:type="spellStart"/>
             <w:proofErr w:type="gramStart"/>
             <w:r>
-              <w:t>enter</w:t>
-            </w:r>
-            <w:r>
-              <w:t>Login</w:t>
-            </w:r>
-            <w:r>
-              <w:t>Info</w:t>
+              <w:t>enterLoginInfo</w:t>
             </w:r>
             <w:proofErr w:type="spellEnd"/>
             <w:r>
@@ -267,10 +255,7 @@
           </w:p>
           <w:p>
             <w:r>
-              <w:t>4</w:t>
-            </w:r>
-            <w:r>
-              <w:t xml:space="preserve">. </w:t>
+              <w:t xml:space="preserve">4. </w:t>
             </w:r>
             <w:proofErr w:type="spellStart"/>
             <w:proofErr w:type="gramStart"/>
@@ -360,13 +345,7 @@
           </w:tcPr>
           <w:p>
             <w:r>
-              <w:t>Log</w:t>
-            </w:r>
-            <w:r>
-              <w:t>out</w:t>
-            </w:r>
-            <w:r>
-              <w:t xml:space="preserve"> UI</w:t>
+              <w:t>Logout UI</w:t>
             </w:r>
           </w:p>
         </w:tc>
@@ -484,13 +463,7 @@
           </w:tcPr>
           <w:p>
             <w:r>
-              <w:t>Register</w:t>
-            </w:r>
-            <w:r>
-              <w:t xml:space="preserve"> UI</w:t>
-            </w:r>
-            <w:r>
-              <w:t xml:space="preserve"> &lt;&lt;boundary&gt;&gt;</w:t>
+              <w:t>Register UI &lt;&lt;boundary&gt;&gt;</w:t>
             </w:r>
           </w:p>
         </w:tc>
@@ -596,10 +569,7 @@
         </w:rPr>
       </w:pPr>
       <w:r>
-        <w:t>#</w:t>
-      </w:r>
-      <w:r>
-        <w:t>5</w:t>
+        <w:t>#5</w:t>
       </w:r>
       <w:r>
         <w:rPr>
@@ -625,10 +595,7 @@
           </w:tcPr>
           <w:p>
             <w:r>
-              <w:t>Browse</w:t>
-            </w:r>
-            <w:r>
-              <w:t xml:space="preserve"> UI &lt;&lt;boundary&gt;&gt;</w:t>
+              <w:t>Browse UI &lt;&lt;boundary&gt;&gt;</w:t>
             </w:r>
           </w:p>
         </w:tc>
@@ -694,10 +661,7 @@
           </w:tcPr>
           <w:p>
             <w:r>
-              <w:t>Browse</w:t>
-            </w:r>
-            <w:r>
-              <w:t xml:space="preserve"> &lt;&lt;control&gt;&gt;</w:t>
+              <w:t>Browse &lt;&lt;control&gt;&gt;</w:t>
             </w:r>
           </w:p>
         </w:tc>
@@ -737,10 +701,7 @@
         </w:rPr>
       </w:pPr>
       <w:r>
-        <w:t>#</w:t>
-      </w:r>
-      <w:r>
-        <w:t>6. Rent Bicycle</w:t>
+        <w:t>#6. Rent Bicycle</w:t>
       </w:r>
     </w:p>
     <w:p/>
@@ -760,10 +721,7 @@
           </w:tcPr>
           <w:p>
             <w:r>
-              <w:t>Rent</w:t>
-            </w:r>
-            <w:r>
-              <w:t xml:space="preserve"> UI &lt;&lt;boundary&gt;&gt;</w:t>
+              <w:t>Rent UI &lt;&lt;boundary&gt;&gt;</w:t>
             </w:r>
           </w:p>
         </w:tc>
@@ -780,10 +738,7 @@
             <w:proofErr w:type="spellStart"/>
             <w:proofErr w:type="gramStart"/>
             <w:r>
-              <w:t>request</w:t>
-            </w:r>
-            <w:r>
-              <w:t>BicycleRental</w:t>
+              <w:t>requestBicycleRental</w:t>
             </w:r>
             <w:proofErr w:type="spellEnd"/>
             <w:r>
@@ -832,10 +787,7 @@
           </w:tcPr>
           <w:p>
             <w:r>
-              <w:t>Rent</w:t>
-            </w:r>
-            <w:r>
-              <w:t xml:space="preserve"> &lt;&lt;control&gt;&gt;</w:t>
+              <w:t>Rent &lt;&lt;control&gt;&gt;</w:t>
             </w:r>
           </w:p>
         </w:tc>
@@ -886,46 +838,41 @@
           <w:p>
             <w:pPr>
               <w:rPr>
+                <w:lang w:eastAsia="ko-KR"/>
+              </w:rPr>
+            </w:pPr>
+            <w:r>
+              <w:t xml:space="preserve">#### Member </w:t>
+            </w:r>
+            <w:r>
+              <w:t>–</w:t>
+            </w:r>
+            <w:r>
+              <w:t xml:space="preserve"> </w:t>
+            </w:r>
+            <w:r>
+              <w:rPr>
                 <w:rFonts w:hint="eastAsia"/>
                 <w:lang w:eastAsia="ko-KR"/>
               </w:rPr>
+              <w:t>재탕!!!</w:t>
+            </w:r>
+          </w:p>
+        </w:tc>
+      </w:tr>
+      <w:tr>
+        <w:tc>
+          <w:tcPr>
+            <w:tcW w:w="9016" w:type="dxa"/>
+          </w:tcPr>
+          <w:p>
+            <w:pPr>
+              <w:rPr>
+                <w:lang w:eastAsia="ko-KR"/>
+              </w:rPr>
             </w:pPr>
             <w:r>
-              <w:t xml:space="preserve">#### Member </w:t>
-            </w:r>
-            <w:r>
-              <w:t>–</w:t>
-            </w:r>
-            <w:r>
-              <w:t xml:space="preserve"> </w:t>
-            </w:r>
-            <w:r>
-              <w:rPr>
-                <w:rFonts w:hint="eastAsia"/>
-                <w:lang w:eastAsia="ko-KR"/>
-              </w:rPr>
-              <w:t>재탕!!!</w:t>
-            </w:r>
-          </w:p>
-        </w:tc>
-      </w:tr>
-      <w:tr>
-        <w:tc>
-          <w:tcPr>
-            <w:tcW w:w="9016" w:type="dxa"/>
-          </w:tcPr>
-          <w:p>
-            <w:pPr>
-              <w:rPr>
-                <w:rFonts w:hint="eastAsia"/>
-                <w:lang w:eastAsia="ko-KR"/>
-              </w:rPr>
-            </w:pPr>
-            <w:r>
-              <w:t>Login-5</w:t>
-            </w:r>
-            <w:r>
-              <w:t xml:space="preserve">. </w:t>
+              <w:t xml:space="preserve">Login-5. </w:t>
             </w:r>
             <w:proofErr w:type="spellStart"/>
             <w:r>
@@ -1333,7 +1280,6 @@
           <w:p>
             <w:pPr>
               <w:rPr>
-                <w:rFonts w:hint="eastAsia"/>
                 <w:lang w:eastAsia="ko-KR"/>
               </w:rPr>
             </w:pPr>

</xml_diff>

<commit_message>
communication diagram signup 부분 일부 수정
</commit_message>
<xml_diff>
--- a/for communi_& classDia.docx
+++ b/for communi_& classDia.docx
@@ -921,7 +921,13 @@
               <w:rPr>
                 <w:lang w:eastAsia="ko-KR"/>
               </w:rPr>
-              <w:t>displayLoginMsg</w:t>
+              <w:t>showSignup</w:t>
+            </w:r>
+            <w:r>
+              <w:rPr>
+                <w:lang w:eastAsia="ko-KR"/>
+              </w:rPr>
+              <w:t>Msg</w:t>
             </w:r>
             <w:proofErr w:type="spellEnd"/>
             <w:r>

</xml_diff>